<commit_message>
Completa la tabla de registro de prompts en el documento resuelto
</commit_message>
<xml_diff>
--- a/Práctica 1. Documentar y versionar con un agente (RESUELTA).docx
+++ b/Práctica 1. Documentar y versionar con un agente (RESUELTA).docx
@@ -2224,69 +2224,271 @@
           <w:tcPr>
             <w:tcW w:w="567" w:type="dxa"/>
           </w:tcPr>
-          <w:p>
-            <w:pPr>
-              <w:spacing w:after="40"/>
-            </w:pPr>
-            <w:r>
-              <w:rPr>
-                <w:rFonts w:ascii="Calibri" w:hAnsi="Calibri" w:cs="Calibri"/>
-                <w:sz w:val="18"/>
-              </w:rPr>
-              <w:t>1</w:t>
-            </w:r>
-          </w:p>
         </w:tc>
         <w:tc>
           <w:tcPr>
             <w:tcW w:w="2948" w:type="dxa"/>
           </w:tcPr>
-          <w:p>
-            <w:pPr>
-              <w:spacing w:after="40"/>
-            </w:pPr>
-            <w:r>
-              <w:rPr>
-                <w:rFonts w:ascii="Calibri" w:hAnsi="Calibri" w:cs="Calibri"/>
-                <w:sz w:val="18"/>
-              </w:rPr>
-              <w:t>Explica qué hace este proyecto y qué ficheros lo componen</w:t>
-            </w:r>
-          </w:p>
         </w:tc>
         <w:tc>
           <w:tcPr>
             <w:tcW w:w="2665" w:type="dxa"/>
           </w:tcPr>
-          <w:p>
-            <w:pPr>
-              <w:spacing w:after="40"/>
-            </w:pPr>
-            <w:r>
-              <w:rPr>
-                <w:rFonts w:ascii="Calibri" w:hAnsi="Calibri" w:cs="Calibri"/>
-                <w:sz w:val="18"/>
-              </w:rPr>
-              <w:t>Resumen correcto; se inventó una carpeta tests/</w:t>
-            </w:r>
-          </w:p>
         </w:tc>
         <w:tc>
           <w:tcPr>
             <w:tcW w:w="2608" w:type="dxa"/>
           </w:tcPr>
-          <w:p>
-            <w:pPr>
-              <w:spacing w:after="40"/>
-            </w:pPr>
-            <w:r>
-              <w:rPr>
-                <w:rFonts w:ascii="Calibri" w:hAnsi="Calibri" w:cs="Calibri"/>
-                <w:sz w:val="18"/>
-              </w:rPr>
-              <w:t>Le indiqué que no existe y lo comprobé con ls</w:t>
-            </w:r>
-          </w:p>
+        </w:tc>
+      </w:tr>
+      <w:tr>
+        <w:trPr>
+          <w:jc w:val="center"/>
+        </w:trPr>
+        <w:tc>
+          <w:tcPr>
+            <w:tcW w:w="567" w:type="dxa"/>
+          </w:tcPr>
+        </w:tc>
+        <w:tc>
+          <w:tcPr>
+            <w:tcW w:w="2948" w:type="dxa"/>
+          </w:tcPr>
+        </w:tc>
+        <w:tc>
+          <w:tcPr>
+            <w:tcW w:w="2665" w:type="dxa"/>
+          </w:tcPr>
+        </w:tc>
+        <w:tc>
+          <w:tcPr>
+            <w:tcW w:w="2608" w:type="dxa"/>
+          </w:tcPr>
+        </w:tc>
+      </w:tr>
+      <w:tr>
+        <w:trPr>
+          <w:jc w:val="center"/>
+        </w:trPr>
+        <w:tc>
+          <w:tcPr>
+            <w:tcW w:w="567" w:type="dxa"/>
+          </w:tcPr>
+        </w:tc>
+        <w:tc>
+          <w:tcPr>
+            <w:tcW w:w="2948" w:type="dxa"/>
+          </w:tcPr>
+        </w:tc>
+        <w:tc>
+          <w:tcPr>
+            <w:tcW w:w="2665" w:type="dxa"/>
+          </w:tcPr>
+        </w:tc>
+        <w:tc>
+          <w:tcPr>
+            <w:tcW w:w="2608" w:type="dxa"/>
+          </w:tcPr>
+        </w:tc>
+      </w:tr>
+      <w:tr>
+        <w:trPr>
+          <w:jc w:val="center"/>
+        </w:trPr>
+        <w:tc>
+          <w:tcPr>
+            <w:tcW w:w="567" w:type="dxa"/>
+          </w:tcPr>
+        </w:tc>
+        <w:tc>
+          <w:tcPr>
+            <w:tcW w:w="2948" w:type="dxa"/>
+          </w:tcPr>
+        </w:tc>
+        <w:tc>
+          <w:tcPr>
+            <w:tcW w:w="2665" w:type="dxa"/>
+          </w:tcPr>
+        </w:tc>
+        <w:tc>
+          <w:tcPr>
+            <w:tcW w:w="2608" w:type="dxa"/>
+          </w:tcPr>
+        </w:tc>
+      </w:tr>
+      <w:tr>
+        <w:trPr>
+          <w:jc w:val="center"/>
+        </w:trPr>
+        <w:tc>
+          <w:tcPr>
+            <w:tcW w:w="567" w:type="dxa"/>
+          </w:tcPr>
+        </w:tc>
+        <w:tc>
+          <w:tcPr>
+            <w:tcW w:w="2948" w:type="dxa"/>
+          </w:tcPr>
+        </w:tc>
+        <w:tc>
+          <w:tcPr>
+            <w:tcW w:w="2665" w:type="dxa"/>
+          </w:tcPr>
+        </w:tc>
+        <w:tc>
+          <w:tcPr>
+            <w:tcW w:w="2608" w:type="dxa"/>
+          </w:tcPr>
+        </w:tc>
+      </w:tr>
+      <w:tr>
+        <w:trPr>
+          <w:jc w:val="center"/>
+        </w:trPr>
+        <w:tc>
+          <w:tcPr>
+            <w:tcW w:w="567" w:type="dxa"/>
+          </w:tcPr>
+        </w:tc>
+        <w:tc>
+          <w:tcPr>
+            <w:tcW w:w="2948" w:type="dxa"/>
+          </w:tcPr>
+        </w:tc>
+        <w:tc>
+          <w:tcPr>
+            <w:tcW w:w="2665" w:type="dxa"/>
+          </w:tcPr>
+        </w:tc>
+        <w:tc>
+          <w:tcPr>
+            <w:tcW w:w="2608" w:type="dxa"/>
+          </w:tcPr>
+        </w:tc>
+      </w:tr>
+      <w:tr>
+        <w:trPr>
+          <w:jc w:val="center"/>
+        </w:trPr>
+        <w:tc>
+          <w:tcPr>
+            <w:tcW w:w="567" w:type="dxa"/>
+          </w:tcPr>
+        </w:tc>
+        <w:tc>
+          <w:tcPr>
+            <w:tcW w:w="2948" w:type="dxa"/>
+          </w:tcPr>
+        </w:tc>
+        <w:tc>
+          <w:tcPr>
+            <w:tcW w:w="2665" w:type="dxa"/>
+          </w:tcPr>
+        </w:tc>
+        <w:tc>
+          <w:tcPr>
+            <w:tcW w:w="2608" w:type="dxa"/>
+          </w:tcPr>
+        </w:tc>
+      </w:tr>
+      <w:tr>
+        <w:trPr>
+          <w:jc w:val="center"/>
+        </w:trPr>
+        <w:tc>
+          <w:tcPr>
+            <w:tcW w:w="567" w:type="dxa"/>
+          </w:tcPr>
+        </w:tc>
+        <w:tc>
+          <w:tcPr>
+            <w:tcW w:w="2948" w:type="dxa"/>
+          </w:tcPr>
+        </w:tc>
+        <w:tc>
+          <w:tcPr>
+            <w:tcW w:w="2665" w:type="dxa"/>
+          </w:tcPr>
+        </w:tc>
+        <w:tc>
+          <w:tcPr>
+            <w:tcW w:w="2608" w:type="dxa"/>
+          </w:tcPr>
+        </w:tc>
+      </w:tr>
+      <w:tr>
+        <w:trPr>
+          <w:jc w:val="center"/>
+        </w:trPr>
+        <w:tc>
+          <w:tcPr>
+            <w:tcW w:w="567" w:type="dxa"/>
+          </w:tcPr>
+        </w:tc>
+        <w:tc>
+          <w:tcPr>
+            <w:tcW w:w="2948" w:type="dxa"/>
+          </w:tcPr>
+        </w:tc>
+        <w:tc>
+          <w:tcPr>
+            <w:tcW w:w="2665" w:type="dxa"/>
+          </w:tcPr>
+        </w:tc>
+        <w:tc>
+          <w:tcPr>
+            <w:tcW w:w="2608" w:type="dxa"/>
+          </w:tcPr>
+        </w:tc>
+      </w:tr>
+      <w:tr>
+        <w:trPr>
+          <w:jc w:val="center"/>
+        </w:trPr>
+        <w:tc>
+          <w:tcPr>
+            <w:tcW w:w="567" w:type="dxa"/>
+          </w:tcPr>
+        </w:tc>
+        <w:tc>
+          <w:tcPr>
+            <w:tcW w:w="2948" w:type="dxa"/>
+          </w:tcPr>
+        </w:tc>
+        <w:tc>
+          <w:tcPr>
+            <w:tcW w:w="2665" w:type="dxa"/>
+          </w:tcPr>
+        </w:tc>
+        <w:tc>
+          <w:tcPr>
+            <w:tcW w:w="2608" w:type="dxa"/>
+          </w:tcPr>
+        </w:tc>
+      </w:tr>
+      <w:tr>
+        <w:trPr>
+          <w:jc w:val="center"/>
+        </w:trPr>
+        <w:tc>
+          <w:tcPr>
+            <w:tcW w:w="567" w:type="dxa"/>
+          </w:tcPr>
+        </w:tc>
+        <w:tc>
+          <w:tcPr>
+            <w:tcW w:w="2948" w:type="dxa"/>
+          </w:tcPr>
+        </w:tc>
+        <w:tc>
+          <w:tcPr>
+            <w:tcW w:w="2665" w:type="dxa"/>
+          </w:tcPr>
+        </w:tc>
+        <w:tc>
+          <w:tcPr>
+            <w:tcW w:w="2608" w:type="dxa"/>
+          </w:tcPr>
         </w:tc>
       </w:tr>
     </w:tbl>

</xml_diff>

<commit_message>
Corrige el relleno de la tabla de registro de prompts
</commit_message>
<xml_diff>
--- a/Práctica 1. Documentar y versionar con un agente (RESUELTA).docx
+++ b/Práctica 1. Documentar y versionar con un agente (RESUELTA).docx
@@ -2224,21 +2224,41 @@
           <w:tcPr>
             <w:tcW w:w="567" w:type="dxa"/>
           </w:tcPr>
+          <w:p>
+            <w:r>
+              <w:t>1</w:t>
+            </w:r>
+          </w:p>
         </w:tc>
         <w:tc>
           <w:tcPr>
             <w:tcW w:w="2948" w:type="dxa"/>
           </w:tcPr>
+          <w:p>
+            <w:r>
+              <w:t>«Explica qué hace este proyecto, qué ficheros lo componen y cómo se ejecuta» (modo Plan)</w:t>
+            </w:r>
+          </w:p>
         </w:tc>
         <w:tc>
           <w:tcPr>
             <w:tcW w:w="2665" w:type="dxa"/>
           </w:tcPr>
+          <w:p>
+            <w:r>
+              <w:t>Resumen correcto: describió los 4 ficheros, las órdenes de la CLI y advirtió del fallo de completar.</w:t>
+            </w:r>
+          </w:p>
         </w:tc>
         <w:tc>
           <w:tcPr>
             <w:tcW w:w="2608" w:type="dxa"/>
           </w:tcPr>
+          <w:p>
+            <w:r>
+              <w:t>Nada; comprobé con ls -R, node --version y ejecutando la CLI que todo lo citado existe de verdad.</w:t>
+            </w:r>
+          </w:p>
         </w:tc>
       </w:tr>
       <w:tr>
@@ -2249,21 +2269,41 @@
           <w:tcPr>
             <w:tcW w:w="567" w:type="dxa"/>
           </w:tcPr>
+          <w:p>
+            <w:r>
+              <w:t>2</w:t>
+            </w:r>
+          </w:p>
         </w:tc>
         <w:tc>
           <w:tcPr>
             <w:tcW w:w="2948" w:type="dxa"/>
           </w:tcPr>
+          <w:p>
+            <w:r>
+              <w:t>«Genera el fichero AGENTS.md del proyecto» (equivalente a /init)</w:t>
+            </w:r>
+          </w:p>
         </w:tc>
         <w:tc>
           <w:tcPr>
             <w:tcW w:w="2665" w:type="dxa"/>
           </w:tcPr>
+          <w:p>
+            <w:r>
+              <w:t>Borrador completo con descripción, estructura, comandos y normas.</w:t>
+            </w:r>
+          </w:p>
         </w:tc>
         <w:tc>
           <w:tcPr>
             <w:tcW w:w="2608" w:type="dxa"/>
           </w:tcPr>
+          <w:p>
+            <w:r>
+              <w:t>Se inventó una carpeta test/ que no existía (comprobado con ls) y la eliminé del documento.</w:t>
+            </w:r>
+          </w:p>
         </w:tc>
       </w:tr>
       <w:tr>
@@ -2274,21 +2314,41 @@
           <w:tcPr>
             <w:tcW w:w="567" w:type="dxa"/>
           </w:tcPr>
+          <w:p>
+            <w:r>
+              <w:t>3</w:t>
+            </w:r>
+          </w:p>
         </w:tc>
         <w:tc>
           <w:tcPr>
             <w:tcW w:w="2948" w:type="dxa"/>
           </w:tcPr>
+          <w:p>
+            <w:r>
+              <w:t>«Configura opencode.json: pide permiso para las órdenes del sistema, prohíbe git push y rm, bloquea .env, limita la escritura a src/, test/ y docs/, e impide compartir la sesión»</w:t>
+            </w:r>
+          </w:p>
         </w:tc>
         <w:tc>
           <w:tcPr>
             <w:tcW w:w="2665" w:type="dxa"/>
           </w:tcPr>
+          <w:p>
+            <w:r>
+              <w:t>Escribió la configuración en formato V2 (permissions ordenadas, share: "disabled"). Verificado: git push y una escritura a notas.txt quedaron denegados.</w:t>
+            </w:r>
+          </w:p>
         </w:tc>
         <w:tc>
           <w:tcPr>
             <w:tcW w:w="2608" w:type="dxa"/>
           </w:tcPr>
+          <w:p>
+            <w:r>
+              <w:t>Añadí excepciones explícitas para los ficheros de la raíz que exige la propia práctica (README.md, AGENTS.md, prompts.md, opencode.json).</w:t>
+            </w:r>
+          </w:p>
         </w:tc>
       </w:tr>
       <w:tr>
@@ -2299,21 +2359,41 @@
           <w:tcPr>
             <w:tcW w:w="567" w:type="dxa"/>
           </w:tcPr>
+          <w:p>
+            <w:r>
+              <w:t>4</w:t>
+            </w:r>
+          </w:p>
         </w:tc>
         <w:tc>
           <w:tcPr>
             <w:tcW w:w="2948" w:type="dxa"/>
           </w:tcPr>
+          <w:p>
+            <w:r>
+              <w:t>«Documenta con JSDoc las seis funciones de src/tareas.js con @param, @returns, @throws y un @example»</w:t>
+            </w:r>
+          </w:p>
         </w:tc>
         <w:tc>
           <w:tcPr>
             <w:tcW w:w="2665" w:type="dxa"/>
           </w:tcPr>
+          <w:p>
+            <w:r>
+              <w:t>Añadió JSDoc completo a las seis funciones exportadas (y a guardar, interna).</w:t>
+            </w:r>
+          </w:p>
         </w:tc>
         <w:tc>
           <w:tcPr>
             <w:tcW w:w="2608" w:type="dxa"/>
           </w:tcPr>
+          <w:p>
+            <w:r>
+              <w:t>resumen() estaba mal documentada (decía que devolvía un número y devuelve un objeto): la corregí. También anoté que la descripción de completar() no coincidía con el código (id ≠ índice), pendiente para el ejercicio 6.</w:t>
+            </w:r>
+          </w:p>
         </w:tc>
       </w:tr>
       <w:tr>
@@ -2324,21 +2404,41 @@
           <w:tcPr>
             <w:tcW w:w="567" w:type="dxa"/>
           </w:tcPr>
+          <w:p>
+            <w:r>
+              <w:t>5</w:t>
+            </w:r>
+          </w:p>
         </w:tc>
         <w:tc>
           <w:tcPr>
             <w:tcW w:w="2948" w:type="dxa"/>
           </w:tcPr>
+          <w:p>
+            <w:r>
+              <w:t>«Escribe el README del proyecto con todas las secciones pedidas, con un ejemplo por cada orden de la CLI»</w:t>
+            </w:r>
+          </w:p>
         </w:tc>
         <w:tc>
           <w:tcPr>
             <w:tcW w:w="2665" w:type="dxa"/>
           </w:tcPr>
+          <w:p>
+            <w:r>
+              <w:t>README completo y bien estructurado.</w:t>
+            </w:r>
+          </w:p>
         </w:tc>
         <w:tc>
           <w:tcPr>
             <w:tcW w:w="2608" w:type="dxa"/>
           </w:tcPr>
+          <w:p>
+            <w:r>
+              <w:t>Ejecuté todos los comandos: dos salidas mal documentadas de anadir y eliminar, y un atajo inexistente (npm run listar) que eliminé. La discrepancia de completar no era de documentación: era el fallo del código.</w:t>
+            </w:r>
+          </w:p>
         </w:tc>
       </w:tr>
       <w:tr>
@@ -2349,21 +2449,41 @@
           <w:tcPr>
             <w:tcW w:w="567" w:type="dxa"/>
           </w:tcPr>
+          <w:p>
+            <w:r>
+              <w:t>6</w:t>
+            </w:r>
+          </w:p>
         </w:tc>
         <w:tc>
           <w:tcPr>
             <w:tcW w:w="2948" w:type="dxa"/>
           </w:tcPr>
+          <w:p>
+            <w:r>
+              <w:t>«El proyecto tiene un fallo: node src/cli.js completar 1 no marca la tarea que debería; escribe en test/ una prueba con node:test que lo demuestre» (sin decir la causa)</w:t>
+            </w:r>
+          </w:p>
         </w:tc>
         <w:tc>
           <w:tcPr>
             <w:tcW w:w="2665" w:type="dxa"/>
           </w:tcPr>
+          <w:p>
+            <w:r>
+              <w:t>Prueba con beforeEach/afterEach que protege los datos reales; npm test falló mostrando el AssertionError.</w:t>
+            </w:r>
+          </w:p>
         </w:tc>
         <w:tc>
           <w:tcPr>
             <w:tcW w:w="2608" w:type="dxa"/>
           </w:tcPr>
+          <w:p>
+            <w:r>
+              <w:t>Nada; revisé que la prueba comprueba lo que dice y no toca los datos.</w:t>
+            </w:r>
+          </w:p>
         </w:tc>
       </w:tr>
       <w:tr>
@@ -2374,21 +2494,41 @@
           <w:tcPr>
             <w:tcW w:w="567" w:type="dxa"/>
           </w:tcPr>
+          <w:p>
+            <w:r>
+              <w:t>7</w:t>
+            </w:r>
+          </w:p>
         </w:tc>
         <w:tc>
           <w:tcPr>
             <w:tcW w:w="2948" w:type="dxa"/>
           </w:tcPr>
+          <w:p>
+            <w:r>
+              <w:t>«Corrige src/tareas.js para que la prueba pase»</w:t>
+            </w:r>
+          </w:p>
         </w:tc>
         <w:tc>
           <w:tcPr>
             <w:tcW w:w="2665" w:type="dxa"/>
           </w:tcPr>
+          <w:p>
+            <w:r>
+              <w:t>Localizó la tarea con find por id y lanza un error claro si no existe; npm test en verde.</w:t>
+            </w:r>
+          </w:p>
         </w:tc>
         <w:tc>
           <w:tcPr>
             <w:tcW w:w="2608" w:type="dxa"/>
           </w:tcPr>
+          <w:p>
+            <w:r>
+              <w:t>Nada; revisé el diff (@throws actualizado incluido).</w:t>
+            </w:r>
+          </w:p>
         </w:tc>
       </w:tr>
       <w:tr>
@@ -2399,21 +2539,41 @@
           <w:tcPr>
             <w:tcW w:w="567" w:type="dxa"/>
           </w:tcPr>
+          <w:p>
+            <w:r>
+              <w:t>8</w:t>
+            </w:r>
+          </w:p>
         </w:tc>
         <w:tc>
           <w:tcPr>
             <w:tcW w:w="2948" w:type="dxa"/>
           </w:tcPr>
+          <w:p>
+            <w:r>
+              <w:t>«Prepara los cambios en commits separados (documentación, pruebas y corrección)»</w:t>
+            </w:r>
+          </w:p>
         </w:tc>
         <w:tc>
           <w:tcPr>
             <w:tcW w:w="2665" w:type="dxa"/>
           </w:tcPr>
+          <w:p>
+            <w:r>
+              <w:t>Tres commits en español siguiendo la convención «Añade…/Corrige…».</w:t>
+            </w:r>
+          </w:p>
         </w:tc>
         <w:tc>
           <w:tcPr>
             <w:tcW w:w="2608" w:type="dxa"/>
           </w:tcPr>
+          <w:p>
+            <w:r>
+              <w:t>Revisé git diff --staged antes de cada commit.</w:t>
+            </w:r>
+          </w:p>
         </w:tc>
       </w:tr>
       <w:tr>
@@ -2424,21 +2584,41 @@
           <w:tcPr>
             <w:tcW w:w="567" w:type="dxa"/>
           </w:tcPr>
+          <w:p>
+            <w:r>
+              <w:t>9</w:t>
+            </w:r>
+          </w:p>
         </w:tc>
         <w:tc>
           <w:tcPr>
             <w:tcW w:w="2948" w:type="dxa"/>
           </w:tcPr>
+          <w:p>
+            <w:r>
+              <w:t>«Crea docs/control-de-versiones.md con la instalación y configuración de Git, el flujo de trabajo, la convención de mensajes y cómo revisar el trabajo de un agente»</w:t>
+            </w:r>
+          </w:p>
         </w:tc>
         <w:tc>
           <w:tcPr>
             <w:tcW w:w="2665" w:type="dxa"/>
           </w:tcPr>
+          <w:p>
+            <w:r>
+              <w:t>Documento completo y verificado con git log --oneline --graph.</w:t>
+            </w:r>
+          </w:p>
         </w:tc>
         <w:tc>
           <w:tcPr>
             <w:tcW w:w="2608" w:type="dxa"/>
           </w:tcPr>
+          <w:p>
+            <w:r>
+              <w:t>Nada.</w:t>
+            </w:r>
+          </w:p>
         </w:tc>
       </w:tr>
       <w:tr>
@@ -2449,21 +2629,41 @@
           <w:tcPr>
             <w:tcW w:w="567" w:type="dxa"/>
           </w:tcPr>
+          <w:p>
+            <w:r>
+              <w:t>10</w:t>
+            </w:r>
+          </w:p>
         </w:tc>
         <w:tc>
           <w:tcPr>
             <w:tcW w:w="2948" w:type="dxa"/>
           </w:tcPr>
+          <w:p>
+            <w:r>
+              <w:t>«Convierte el README a HTML y PDF y añade una tabla comparativa de los tres formatos»</w:t>
+            </w:r>
+          </w:p>
         </w:tc>
         <w:tc>
           <w:tcPr>
             <w:tcW w:w="2665" w:type="dxa"/>
           </w:tcPr>
+          <w:p>
+            <w:r>
+              <w:t>Script de conversión reproducible, HTML y PDF generados, tabla añadida al README.</w:t>
+            </w:r>
+          </w:p>
         </w:tc>
         <w:tc>
           <w:tcPr>
             <w:tcW w:w="2608" w:type="dxa"/>
           </w:tcPr>
+          <w:p>
+            <w:r>
+              <w:t>Nada; verifiqué el PDF visualmente (páginas, estilos y tabla).</w:t>
+            </w:r>
+          </w:p>
         </w:tc>
       </w:tr>
       <w:tr>
@@ -2474,21 +2674,41 @@
           <w:tcPr>
             <w:tcW w:w="567" w:type="dxa"/>
           </w:tcPr>
+          <w:p>
+            <w:r>
+              <w:t>11</w:t>
+            </w:r>
+          </w:p>
         </w:tc>
         <w:tc>
           <w:tcPr>
             <w:tcW w:w="2948" w:type="dxa"/>
           </w:tcPr>
+          <w:p>
+            <w:r>
+              <w:t>«Genera el informe final en PDF con el enunciado, las soluciones y las salidas reales de cada ejercicio»</w:t>
+            </w:r>
+          </w:p>
         </w:tc>
         <w:tc>
           <w:tcPr>
             <w:tcW w:w="2665" w:type="dxa"/>
           </w:tcPr>
+          <w:p>
+            <w:r>
+              <w:t>Compuso el informe en HTML (cabecera del IES, tablas y bloques de comandos) y lo convirtió a PDF con LibreOffice.</w:t>
+            </w:r>
+          </w:p>
         </w:tc>
         <w:tc>
           <w:tcPr>
             <w:tcW w:w="2608" w:type="dxa"/>
           </w:tcPr>
+          <w:p>
+            <w:r>
+              <w:t>Nada; revisé el PDF página a página y ajusté el formato para que tablas y bloques de código se lean bien.</w:t>
+            </w:r>
+          </w:p>
         </w:tc>
       </w:tr>
     </w:tbl>

</xml_diff>